<commit_message>
Rebuild all copies; Figure 5.1 panels and simple percentage change; comment 26; ambiguity check; before-and-after preview with review notes; logs
Co-Authored-By: Claude Sonnet 5.5 <noreply@anthropic.com>
Claude-Session: https://claude.ai/code/session_01XxH9J9TaLYfAYFCaGAqS9y
</commit_message>
<xml_diff>
--- a/papers/thesis_2026-10/reading/thesis_YZU_layout_2026-10-25.docx
+++ b/papers/thesis_2026-10/reading/thesis_YZU_layout_2026-10-25.docx
@@ -1564,7 +1564,7 @@
         <w:pStyle w:val="BodyText"/>
       </w:pPr>
       <w:r>
-        <w:t xml:space="preserve">There are three reasons why this thesis focuses on Indonesia. First, Indonesia allows the question to be tested. Several platforms report revenue and transaction value each year, and BPS asks online sellers when they began and how their sales changed. Second, the two sources already differ on scale: for 2024, BPS gives about US$81 billion for online sales and the central bank about US$31 billion (BPS 2025b; Bank Indonesia 2025). Third, new rules on platform commissions, discounts and tax act directly on these figures, so the evidence bears on how far those rules can reach.</w:t>
+        <w:t xml:space="preserve">There are three reasons why this thesis focuses on Indonesia. First, Indonesia allows the question to be tested. Several platforms report revenue and transaction value each year, and BPS asks online sellers when they began and how their sales changed. Second, the two sources already differ on scale, probably because they cover different sellers: for 2024, BPS gives about US$81 billion for online sales and the central bank about US$31 billion (BPS 2025b; Bank Indonesia 2025). Third, new rules on platform commissions, discounts and tax act directly on these figures, so the evidence bears on how far those rules can reach.</w:t>
       </w:r>
     </w:p>
     <w:p>
@@ -8538,7 +8538,7 @@
         <w:pStyle w:val="BodyText"/>
       </w:pPr>
       <w:r>
-        <w:t xml:space="preserve">Table 3 tests H1 in growth rates. Abroad, a rise of 1 percentage point in the growth of transaction value goes with a rise of 0.99 points in the growth of revenue (standard error 0.07), which cannot be told from the 1 that proportional growth requires (p = 0.84). The two growth rates correlate at 0.90. In Indonesia and the region the slope is 0.40 (standard error 0.16) and differs from 1 (p = 0.02). The correlation is 0.31, and the constant is 0.44: revenue grew by about 44 percent a year whatever transaction value did. In the regression on all platforms, the slope of the Indonesian and regional group is 0.59 below the foreign slope, and the two correlations differ (p &lt; 0.001). The Indonesian and regional result rests on 15 pairs from five platforms, so its standard errors are less reliable than those abroad.</w:t>
+        <w:t xml:space="preserve">Table 3 tests H1 in growth rates. Abroad, a rise of 1 percentage point in the growth of transaction value goes with a rise of 0.99 points in the growth of revenue (standard error 0.07), which cannot be told from the 1 that proportional growth requires (p = 0.84). The two growth rates correlate at 0.90. In Indonesia and the region the slope is 0.40 (standard error 0.16) and differs from 1 (p = 0.02). The correlation is 0.31, and the constant is 0.44: revenue grew by about 44 percent a year whatever transaction value did. In the regression on all platforms, the slope of the Indonesian and regional group is 0.59 below the foreign slope. The Indonesian and regional result rests on 15 pairs from five platforms, so its standard errors are less reliable than those abroad.</w:t>
       </w:r>
     </w:p>
     <w:p>
@@ -9863,7 +9863,7 @@
         <w:pStyle w:val="BodyText"/>
       </w:pPr>
       <w:r>
-        <w:t xml:space="preserve">The thin take rate of Indonesian and regional platforms explains much of the threefold difference, an exploratory finding. Measured in percentage points, both groups changed their take rates by about 1 point a year, and the difference between them is nowhere near large enough to count (p = 0.65). The two groups differ in the take rate they start from. The typical Indonesian and regional platform keeps about 1.6 percent of each sale, against about 17 percent abroad. The thinnest take rates belong to the three marketplaces, while Grab and GoTo keep shares closer to those abroad. As Section 3.2 showed, the same 1-point rise then has very different effects. It lifts revenue by more than half at the thinner take rate and by about 6 percent at the thicker one. Figure 2 shows the measures side by side. The test shows that take rates moved, but not what the platforms changed to move them.</w:t>
+        <w:t xml:space="preserve">The thin take rate of Indonesian and regional platforms explains much of the threefold difference, an exploratory finding. Measured in percentage points, both groups changed their take rates by about 1 point a year, and the difference between them is nowhere near large enough to count (p = 0.65). The two groups differ in the take rate they start from. The typical Indonesian and regional platform keeps about 1.6 percent of each sale, against about 17 percent abroad. The thinnest take rates belong to the three marketplaces, while Grab and GoTo keep shares closer to those abroad. As Section 3.2 showed, the same 1-point rise then has very different effects. It lifts revenue by more than half at the thinner take rate and by about 6 percent at the thicker one. Figure 2 shows the three measures side by side, in its Panels A, B and C. The test shows that take rates moved, but not what the platforms changed to move them.</w:t>
       </w:r>
     </w:p>
     <w:p>
@@ -9939,7 +9939,7 @@
         <w:pStyle w:val="TableNote"/>
       </w:pPr>
       <w:r>
-        <w:t xml:space="preserve">Each dot is one platform’s median over its years. Left: the share of each sale that the platform keeps, on a log scale. Middle: the yearly change in that share, in percentage points. Right: the same change relative to the share itself, as a log change in percent. Black bars mark group medians. The foreign group has 26 platforms here and 27 in the main test, because one platform has no pair of usable years for the change in points. Source: company filings; author’s calculations. Exploratory.</w:t>
+        <w:t xml:space="preserve">Each dot is one platform’s median over its years. Panel A: the share of each sale that the platform keeps, on a log scale. Panel B: the yearly change in that share, in percentage points. Panel C: the same change relative to the share itself, as a simple percentage change. Black bars mark group medians. The foreign group has 26 platforms here and 27 in the main test, because one platform has no pair of usable years for the change in points. Source: company filings; author’s calculations. Exploratory.</w:t>
       </w:r>
     </w:p>
     <w:bookmarkEnd w:id="55"/>
@@ -14022,7 +14022,7 @@
         <w:pStyle w:val="BodyText"/>
       </w:pPr>
       <w:r>
-        <w:t xml:space="preserve">The ecosystem ratio is different. The Indonesian and regional platforms have a ratio 13 to 17 points above foreign platforms of the same type, size and age, in markets with the same growth, inflation and interest rates (columns 4 to 6). The foreign mean is about 9. The wild-bootstrap p-values are between 0.005 and 0.04, so five platforms are enough to separate the two groups. Size and age explain little of the ratio. Type explains a good deal: on-demand platforms have ratios 17 to 20 points below marketplaces, which means that they keep a much larger share of each sale, and travel, freelance and resale platforms are 7 to 14 points below. A home market that grows faster has a higher ratio, by about 1.3 to 1.5 points for each point of GDP growth, an exploratory pattern that the thesis does not read as causal.</w:t>
+        <w:t xml:space="preserve">The ecosystem ratio is different. The Indonesian and regional platforms have a ratio 13 to 17 points above foreign platforms of the same type, size and age, in markets with the same growth, inflation and interest rates (columns 4 to 6). The foreign mean is about 9. The wild-bootstrap p-values, which allow for the small number of clusters, are between 0.005 and 0.04. Size and age explain little of the ratio. Type explains a good deal: on-demand platforms have ratios 17 to 20 points below marketplaces, which means that they keep a much larger share of each sale, and travel, freelance and resale platforms are 7 to 14 points below. A home market that grows faster has a higher ratio, by about 1.3 to 1.5 points for each point of GDP growth, an exploratory pattern that the thesis does not read as causal.</w:t>
       </w:r>
     </w:p>
     <w:p>
@@ -14030,7 +14030,7 @@
         <w:pStyle w:val="BodyText"/>
       </w:pPr>
       <w:r>
-        <w:t xml:space="preserve">The result for the Indonesian and regional platforms survives the checks of Appendix C. The coefficient stays between 15 and 18 when each of the five platforms is dropped in turn, and it is 21 without Alibaba, Pinduoduo, Rakuten and Shopify. It is 28.5 when the ratio is not capped (p = 0.008), and 17 when a dummy for emerging home markets is added, whose own coefficient is close to zero (0.4, p = 0.94). So the thin take rates of Indonesian and regional platforms are not a general emerging-market pattern. Total assets are those of the whole company, which is larger than the platform business at GoTo, Rakuten and Sea, so size is measured with error, and the result rests on five platforms.</w:t>
+        <w:t xml:space="preserve">The result for the Indonesian and regional platforms survives the checks of Appendix C. The coefficient stays between 15 and 18 when each of the five platforms is dropped in turn, and it is 21 without Alibaba, Pinduoduo, Rakuten and Shopify. It is 28.5 when the ratio is not capped (p = 0.008), 17 when a dummy for emerging home markets is added, whose own coefficient is close to zero (0.4, p = 0.94), and 17 without the six platforms whose main market is ambiguous. So the thin take rates of Indonesian and regional platforms are not a general emerging-market pattern. Total assets are those of the whole company, which is larger than the platform business at GoTo, Rakuten and Sea, so size is measured with error, and the result rests on five platforms.</w:t>
       </w:r>
     </w:p>
     <w:p>
@@ -14138,7 +14138,7 @@
         <w:pStyle w:val="BodyText"/>
       </w:pPr>
       <w:r>
-        <w:t xml:space="preserve">The ecosystem ratio matters for three groups. For investors, a high ratio means that small changes in fees or discounts produce large swings in revenue growth. At the typical Indonesian and regional ratio of 35, the platform keeps about 2.8 percent of each sale, and a rise of 1 point in the take rate lifts revenue by about 36 percent at constant volume. At the typical foreign ratio of 5.5, the same rise lifts it by 6.5 percent. A revenue multiple therefore means something different in the two groups, because each unit of revenue stands for 36 units of transaction value in one and 6.5 in the other. Growth that comes from the take rate cannot go on without end, and Section 5.4 shows that markets priced transaction value.</w:t>
+        <w:t xml:space="preserve">The ecosystem ratio matters for three groups. For investors, a high ratio means that small changes in fees or discounts produce large swings in revenue growth. At the typical Indonesian and regional ratio of 35, the platform keeps about 2.8 percent of each sale, and a rise of 1 point in the take rate lifts revenue by about 36 percent at constant volume. At the typical foreign ratio of 5.5, the same rise lifts it by 6.5 percent. So a revenue multiple means something different in the two groups, because each unit of revenue stands for 36 units of transaction value in one and 6.5 in the other. Growth that comes from the take rate cannot go on without end, and Section 5.4 shows that markets priced transaction value.</w:t>
       </w:r>
     </w:p>
     <w:p>
@@ -36307,8 +36307,8 @@
         </w:tblCellMar>
       </w:tblPr>
       <w:tblGrid>
-        <w:gridCol w:w="1791"/>
-        <w:gridCol w:w="1527"/>
+        <w:gridCol w:w="1974"/>
+        <w:gridCol w:w="1342"/>
         <w:gridCol w:w="1605"/>
         <w:gridCol w:w="750"/>
         <w:gridCol w:w="1510"/>
@@ -36322,7 +36322,7 @@
         </w:trPr>
         <w:tc>
           <w:tcPr>
-            <w:tcW w:w="1791" w:type="dxa"/>
+            <w:tcW w:w="1974" w:type="dxa"/>
             <w:tcBorders>
               <w:bottom w:val="single" w:sz="5" w:space="0" w:color="000000"/>
             </w:tcBorders>
@@ -36345,7 +36345,7 @@
         </w:tc>
         <w:tc>
           <w:tcPr>
-            <w:tcW w:w="1527" w:type="dxa"/>
+            <w:tcW w:w="1342" w:type="dxa"/>
             <w:tcBorders>
               <w:bottom w:val="single" w:sz="5" w:space="0" w:color="000000"/>
             </w:tcBorders>
@@ -36465,7 +36465,7 @@
         </w:trPr>
         <w:tc>
           <w:tcPr>
-            <w:tcW w:w="1791" w:type="dxa"/>
+            <w:tcW w:w="1974" w:type="dxa"/>
           </w:tcPr>
           <w:p>
             <w:pPr>
@@ -36484,7 +36484,7 @@
         </w:tc>
         <w:tc>
           <w:tcPr>
-            <w:tcW w:w="1527" w:type="dxa"/>
+            <w:tcW w:w="1342" w:type="dxa"/>
           </w:tcPr>
           <w:p>
             <w:pPr>
@@ -36584,7 +36584,7 @@
         </w:trPr>
         <w:tc>
           <w:tcPr>
-            <w:tcW w:w="1791" w:type="dxa"/>
+            <w:tcW w:w="1974" w:type="dxa"/>
           </w:tcPr>
           <w:p>
             <w:pPr>
@@ -36603,7 +36603,7 @@
         </w:tc>
         <w:tc>
           <w:tcPr>
-            <w:tcW w:w="1527" w:type="dxa"/>
+            <w:tcW w:w="1342" w:type="dxa"/>
           </w:tcPr>
           <w:p>
             <w:pPr>
@@ -36703,7 +36703,7 @@
         </w:trPr>
         <w:tc>
           <w:tcPr>
-            <w:tcW w:w="1791" w:type="dxa"/>
+            <w:tcW w:w="1974" w:type="dxa"/>
           </w:tcPr>
           <w:p>
             <w:pPr>
@@ -36721,7 +36721,7 @@
         </w:tc>
         <w:tc>
           <w:tcPr>
-            <w:tcW w:w="1527" w:type="dxa"/>
+            <w:tcW w:w="1342" w:type="dxa"/>
           </w:tcPr>
           <w:p>
             <w:pPr>
@@ -36798,7 +36798,7 @@
         </w:trPr>
         <w:tc>
           <w:tcPr>
-            <w:tcW w:w="1791" w:type="dxa"/>
+            <w:tcW w:w="1974" w:type="dxa"/>
           </w:tcPr>
           <w:p>
             <w:pPr>
@@ -36816,7 +36816,7 @@
         </w:tc>
         <w:tc>
           <w:tcPr>
-            <w:tcW w:w="1527" w:type="dxa"/>
+            <w:tcW w:w="1342" w:type="dxa"/>
           </w:tcPr>
           <w:p>
             <w:pPr>
@@ -36893,7 +36893,7 @@
         </w:trPr>
         <w:tc>
           <w:tcPr>
-            <w:tcW w:w="1791" w:type="dxa"/>
+            <w:tcW w:w="1974" w:type="dxa"/>
           </w:tcPr>
           <w:p>
             <w:pPr>
@@ -36911,7 +36911,7 @@
         </w:tc>
         <w:tc>
           <w:tcPr>
-            <w:tcW w:w="1527" w:type="dxa"/>
+            <w:tcW w:w="1342" w:type="dxa"/>
           </w:tcPr>
           <w:p>
             <w:pPr>
@@ -36988,7 +36988,7 @@
         </w:trPr>
         <w:tc>
           <w:tcPr>
-            <w:tcW w:w="1791" w:type="dxa"/>
+            <w:tcW w:w="1974" w:type="dxa"/>
           </w:tcPr>
           <w:p>
             <w:pPr>
@@ -37006,7 +37006,7 @@
         </w:tc>
         <w:tc>
           <w:tcPr>
-            <w:tcW w:w="1527" w:type="dxa"/>
+            <w:tcW w:w="1342" w:type="dxa"/>
           </w:tcPr>
           <w:p>
             <w:pPr>
@@ -37083,7 +37083,7 @@
         </w:trPr>
         <w:tc>
           <w:tcPr>
-            <w:tcW w:w="1791" w:type="dxa"/>
+            <w:tcW w:w="1974" w:type="dxa"/>
           </w:tcPr>
           <w:p>
             <w:pPr>
@@ -37101,7 +37101,7 @@
         </w:tc>
         <w:tc>
           <w:tcPr>
-            <w:tcW w:w="1527" w:type="dxa"/>
+            <w:tcW w:w="1342" w:type="dxa"/>
           </w:tcPr>
           <w:p>
             <w:pPr>
@@ -37178,7 +37178,7 @@
         </w:trPr>
         <w:tc>
           <w:tcPr>
-            <w:tcW w:w="1791" w:type="dxa"/>
+            <w:tcW w:w="1974" w:type="dxa"/>
           </w:tcPr>
           <w:p>
             <w:pPr>
@@ -37196,7 +37196,7 @@
         </w:tc>
         <w:tc>
           <w:tcPr>
-            <w:tcW w:w="1527" w:type="dxa"/>
+            <w:tcW w:w="1342" w:type="dxa"/>
           </w:tcPr>
           <w:p>
             <w:pPr>
@@ -37279,7 +37279,7 @@
         </w:trPr>
         <w:tc>
           <w:tcPr>
-            <w:tcW w:w="1791" w:type="dxa"/>
+            <w:tcW w:w="1974" w:type="dxa"/>
           </w:tcPr>
           <w:p>
             <w:pPr>
@@ -37297,7 +37297,7 @@
         </w:tc>
         <w:tc>
           <w:tcPr>
-            <w:tcW w:w="1527" w:type="dxa"/>
+            <w:tcW w:w="1342" w:type="dxa"/>
           </w:tcPr>
           <w:p>
             <w:pPr>
@@ -37380,7 +37380,7 @@
         </w:trPr>
         <w:tc>
           <w:tcPr>
-            <w:tcW w:w="1791" w:type="dxa"/>
+            <w:tcW w:w="1974" w:type="dxa"/>
           </w:tcPr>
           <w:p>
             <w:pPr>
@@ -37398,7 +37398,7 @@
         </w:tc>
         <w:tc>
           <w:tcPr>
-            <w:tcW w:w="1527" w:type="dxa"/>
+            <w:tcW w:w="1342" w:type="dxa"/>
           </w:tcPr>
           <w:p>
             <w:pPr>
@@ -37487,7 +37487,7 @@
         </w:trPr>
         <w:tc>
           <w:tcPr>
-            <w:tcW w:w="1791" w:type="dxa"/>
+            <w:tcW w:w="1974" w:type="dxa"/>
           </w:tcPr>
           <w:p>
             <w:pPr>
@@ -37505,7 +37505,7 @@
         </w:tc>
         <w:tc>
           <w:tcPr>
-            <w:tcW w:w="1527" w:type="dxa"/>
+            <w:tcW w:w="1342" w:type="dxa"/>
           </w:tcPr>
           <w:p>
             <w:pPr>
@@ -37594,7 +37594,7 @@
         </w:trPr>
         <w:tc>
           <w:tcPr>
-            <w:tcW w:w="1791" w:type="dxa"/>
+            <w:tcW w:w="1974" w:type="dxa"/>
           </w:tcPr>
           <w:p>
             <w:pPr>
@@ -37612,7 +37612,7 @@
         </w:tc>
         <w:tc>
           <w:tcPr>
-            <w:tcW w:w="1527" w:type="dxa"/>
+            <w:tcW w:w="1342" w:type="dxa"/>
           </w:tcPr>
           <w:p>
             <w:pPr>
@@ -37701,7 +37701,7 @@
         </w:trPr>
         <w:tc>
           <w:tcPr>
-            <w:tcW w:w="1791" w:type="dxa"/>
+            <w:tcW w:w="1974" w:type="dxa"/>
           </w:tcPr>
           <w:p>
             <w:pPr>
@@ -37719,7 +37719,7 @@
         </w:tc>
         <w:tc>
           <w:tcPr>
-            <w:tcW w:w="1527" w:type="dxa"/>
+            <w:tcW w:w="1342" w:type="dxa"/>
           </w:tcPr>
           <w:p>
             <w:pPr>
@@ -37808,7 +37808,7 @@
         </w:trPr>
         <w:tc>
           <w:tcPr>
-            <w:tcW w:w="1791" w:type="dxa"/>
+            <w:tcW w:w="1974" w:type="dxa"/>
           </w:tcPr>
           <w:p>
             <w:pPr>
@@ -37826,7 +37826,7 @@
         </w:tc>
         <w:tc>
           <w:tcPr>
-            <w:tcW w:w="1527" w:type="dxa"/>
+            <w:tcW w:w="1342" w:type="dxa"/>
           </w:tcPr>
           <w:p>
             <w:pPr>
@@ -37909,7 +37909,7 @@
         </w:trPr>
         <w:tc>
           <w:tcPr>
-            <w:tcW w:w="1791" w:type="dxa"/>
+            <w:tcW w:w="1974" w:type="dxa"/>
           </w:tcPr>
           <w:p>
             <w:pPr>
@@ -37927,7 +37927,7 @@
         </w:tc>
         <w:tc>
           <w:tcPr>
-            <w:tcW w:w="1527" w:type="dxa"/>
+            <w:tcW w:w="1342" w:type="dxa"/>
           </w:tcPr>
           <w:p>
             <w:pPr>
@@ -38010,7 +38010,7 @@
         </w:trPr>
         <w:tc>
           <w:tcPr>
-            <w:tcW w:w="1791" w:type="dxa"/>
+            <w:tcW w:w="1974" w:type="dxa"/>
           </w:tcPr>
           <w:p>
             <w:pPr>
@@ -38028,7 +38028,7 @@
         </w:tc>
         <w:tc>
           <w:tcPr>
-            <w:tcW w:w="1527" w:type="dxa"/>
+            <w:tcW w:w="1342" w:type="dxa"/>
           </w:tcPr>
           <w:p>
             <w:pPr>
@@ -38117,7 +38117,7 @@
         </w:trPr>
         <w:tc>
           <w:tcPr>
-            <w:tcW w:w="1791" w:type="dxa"/>
+            <w:tcW w:w="1974" w:type="dxa"/>
           </w:tcPr>
           <w:p>
             <w:pPr>
@@ -38135,7 +38135,7 @@
         </w:tc>
         <w:tc>
           <w:tcPr>
-            <w:tcW w:w="1527" w:type="dxa"/>
+            <w:tcW w:w="1342" w:type="dxa"/>
           </w:tcPr>
           <w:p>
             <w:pPr>
@@ -38224,39 +38224,37 @@
         </w:trPr>
         <w:tc>
           <w:tcPr>
-            <w:tcW w:w="1791" w:type="dxa"/>
-          </w:tcPr>
-          <w:p>
-            <w:pPr>
-              <w:pStyle w:val="Compact"/>
-              <w:keepNext/>
-              <w:spacing w:before="0" w:after="0" w:lineRule="exact" w:line="220"/>
-              <w:jc w:val="left"/>
-            </w:pPr>
-            <w:r>
-              <w:rPr>
-                <w:sz w:val="18"/>
-              </w:rPr>
-              <w:t xml:space="preserve">Natural logarithm of the ecosystem ratio</w:t>
-            </w:r>
-          </w:p>
-        </w:tc>
-        <w:tc>
-          <w:tcPr>
-            <w:tcW w:w="1527" w:type="dxa"/>
-          </w:tcPr>
-          <w:p>
-            <w:pPr>
-              <w:pStyle w:val="Compact"/>
-              <w:keepNext/>
-              <w:spacing w:before="0" w:after="0" w:lineRule="exact" w:line="220"/>
-              <w:jc w:val="left"/>
-            </w:pPr>
-            <w:r>
-              <w:rPr>
-                <w:sz w:val="18"/>
-              </w:rPr>
-              <w:t xml:space="preserve">ln(Ecosystem ratio)</w:t>
+            <w:tcW w:w="1974" w:type="dxa"/>
+          </w:tcPr>
+          <w:p>
+            <w:pPr>
+              <w:pStyle w:val="Compact"/>
+              <w:spacing w:before="0" w:after="0" w:lineRule="exact" w:line="220"/>
+              <w:jc w:val="left"/>
+            </w:pPr>
+            <w:r>
+              <w:rPr>
+                <w:sz w:val="18"/>
+              </w:rPr>
+              <w:t xml:space="preserve">Without the six platforms with an ambiguous main market (Sea, Jumia, Mercado Libre, Despegar, Shopify, Fiverr)</w:t>
+            </w:r>
+          </w:p>
+        </w:tc>
+        <w:tc>
+          <w:tcPr>
+            <w:tcW w:w="1342" w:type="dxa"/>
+          </w:tcPr>
+          <w:p>
+            <w:pPr>
+              <w:pStyle w:val="Compact"/>
+              <w:spacing w:before="0" w:after="0" w:lineRule="exact" w:line="220"/>
+              <w:jc w:val="left"/>
+            </w:pPr>
+            <w:r>
+              <w:rPr>
+                <w:sz w:val="18"/>
+              </w:rPr>
+              <w:t xml:space="preserve">ln(Wedge)</w:t>
             </w:r>
           </w:p>
         </w:tc>
@@ -38267,15 +38265,14 @@
           <w:p>
             <w:pPr>
               <w:pStyle w:val="Compact"/>
-              <w:keepNext/>
-              <w:spacing w:before="0" w:after="0" w:lineRule="exact" w:line="220"/>
-              <w:jc w:val="left"/>
-            </w:pPr>
-            <w:r>
-              <w:rPr>
-                <w:sz w:val="18"/>
-              </w:rPr>
-              <w:t xml:space="preserve">1.677</w:t>
+              <w:spacing w:before="0" w:after="0" w:lineRule="exact" w:line="220"/>
+              <w:jc w:val="left"/>
+            </w:pPr>
+            <w:r>
+              <w:rPr>
+                <w:sz w:val="18"/>
+              </w:rPr>
+              <w:t xml:space="preserve">0.145</w:t>
             </w:r>
           </w:p>
         </w:tc>
@@ -38286,15 +38283,14 @@
           <w:p>
             <w:pPr>
               <w:pStyle w:val="Compact"/>
-              <w:keepNext/>
-              <w:spacing w:before="0" w:after="0" w:lineRule="exact" w:line="220"/>
-              <w:jc w:val="left"/>
-            </w:pPr>
-            <w:r>
-              <w:rPr>
-                <w:sz w:val="18"/>
-              </w:rPr>
-              <w:t xml:space="preserve">&lt;0.001</w:t>
+              <w:spacing w:before="0" w:after="0" w:lineRule="exact" w:line="220"/>
+              <w:jc w:val="left"/>
+            </w:pPr>
+            <w:r>
+              <w:rPr>
+                <w:sz w:val="18"/>
+              </w:rPr>
+              <w:t xml:space="preserve">0.743</w:t>
             </w:r>
           </w:p>
         </w:tc>
@@ -38305,15 +38301,14 @@
           <w:p>
             <w:pPr>
               <w:pStyle w:val="Compact"/>
-              <w:keepNext/>
-              <w:spacing w:before="0" w:after="0" w:lineRule="exact" w:line="220"/>
-              <w:jc w:val="left"/>
-            </w:pPr>
-            <w:r>
-              <w:rPr>
-                <w:sz w:val="18"/>
-              </w:rPr>
-              <w:t xml:space="preserve">0.006</w:t>
+              <w:spacing w:before="0" w:after="0" w:lineRule="exact" w:line="220"/>
+              <w:jc w:val="left"/>
+            </w:pPr>
+            <w:r>
+              <w:rPr>
+                <w:sz w:val="18"/>
+              </w:rPr>
+              <w:t xml:space="preserve">0.801</w:t>
             </w:r>
           </w:p>
         </w:tc>
@@ -38324,10 +38319,15 @@
           <w:p>
             <w:pPr>
               <w:pStyle w:val="Compact"/>
-              <w:keepNext/>
-              <w:spacing w:before="0" w:after="0" w:lineRule="exact" w:line="220"/>
-              <w:jc w:val="left"/>
-            </w:pPr>
+              <w:spacing w:before="0" w:after="0" w:lineRule="exact" w:line="220"/>
+              <w:jc w:val="left"/>
+            </w:pPr>
+            <w:r>
+              <w:rPr>
+                <w:sz w:val="18"/>
+              </w:rPr>
+              <w:t xml:space="preserve">144</w:t>
+            </w:r>
           </w:p>
         </w:tc>
       </w:tr>
@@ -38337,7 +38337,233 @@
         </w:trPr>
         <w:tc>
           <w:tcPr>
-            <w:tcW w:w="1791" w:type="dxa"/>
+            <w:tcW w:w="1974" w:type="dxa"/>
+          </w:tcPr>
+          <w:p>
+            <w:pPr>
+              <w:pStyle w:val="Compact"/>
+              <w:spacing w:before="0" w:after="0" w:lineRule="exact" w:line="220"/>
+              <w:jc w:val="left"/>
+            </w:pPr>
+            <w:r>
+              <w:rPr>
+                <w:sz w:val="18"/>
+              </w:rPr>
+              <w:t xml:space="preserve">Without the six platforms with an ambiguous main market (Sea, Jumia, Mercado Libre, Despegar, Shopify, Fiverr)</w:t>
+            </w:r>
+          </w:p>
+        </w:tc>
+        <w:tc>
+          <w:tcPr>
+            <w:tcW w:w="1342" w:type="dxa"/>
+          </w:tcPr>
+          <w:p>
+            <w:pPr>
+              <w:pStyle w:val="Compact"/>
+              <w:spacing w:before="0" w:after="0" w:lineRule="exact" w:line="220"/>
+              <w:jc w:val="left"/>
+            </w:pPr>
+            <w:r>
+              <w:rPr>
+                <w:sz w:val="18"/>
+              </w:rPr>
+              <w:t xml:space="preserve">Ecosystem ratio</w:t>
+            </w:r>
+          </w:p>
+        </w:tc>
+        <w:tc>
+          <w:tcPr>
+            <w:tcW w:w="1605" w:type="dxa"/>
+          </w:tcPr>
+          <w:p>
+            <w:pPr>
+              <w:pStyle w:val="Compact"/>
+              <w:spacing w:before="0" w:after="0" w:lineRule="exact" w:line="220"/>
+              <w:jc w:val="left"/>
+            </w:pPr>
+            <w:r>
+              <w:rPr>
+                <w:sz w:val="18"/>
+              </w:rPr>
+              <w:t xml:space="preserve">16.974</w:t>
+            </w:r>
+          </w:p>
+        </w:tc>
+        <w:tc>
+          <w:tcPr>
+            <w:tcW w:w="750" w:type="dxa"/>
+          </w:tcPr>
+          <w:p>
+            <w:pPr>
+              <w:pStyle w:val="Compact"/>
+              <w:spacing w:before="0" w:after="0" w:lineRule="exact" w:line="220"/>
+              <w:jc w:val="left"/>
+            </w:pPr>
+            <w:r>
+              <w:rPr>
+                <w:sz w:val="18"/>
+              </w:rPr>
+              <w:t xml:space="preserve">&lt;0.001</w:t>
+            </w:r>
+          </w:p>
+        </w:tc>
+        <w:tc>
+          <w:tcPr>
+            <w:tcW w:w="1510" w:type="dxa"/>
+          </w:tcPr>
+          <w:p>
+            <w:pPr>
+              <w:pStyle w:val="Compact"/>
+              <w:spacing w:before="0" w:after="0" w:lineRule="exact" w:line="220"/>
+              <w:jc w:val="left"/>
+            </w:pPr>
+            <w:r>
+              <w:rPr>
+                <w:sz w:val="18"/>
+              </w:rPr>
+              <w:t xml:space="preserve">0.024</w:t>
+            </w:r>
+          </w:p>
+        </w:tc>
+        <w:tc>
+          <w:tcPr>
+            <w:tcW w:w="1320" w:type="dxa"/>
+          </w:tcPr>
+          <w:p>
+            <w:pPr>
+              <w:pStyle w:val="Compact"/>
+              <w:spacing w:before="0" w:after="0" w:lineRule="exact" w:line="220"/>
+              <w:jc w:val="left"/>
+            </w:pPr>
+            <w:r>
+              <w:rPr>
+                <w:sz w:val="18"/>
+              </w:rPr>
+              <w:t xml:space="preserve">144</w:t>
+            </w:r>
+          </w:p>
+        </w:tc>
+      </w:tr>
+      <w:tr>
+        <w:trPr>
+          <w:cantSplit/>
+        </w:trPr>
+        <w:tc>
+          <w:tcPr>
+            <w:tcW w:w="1974" w:type="dxa"/>
+          </w:tcPr>
+          <w:p>
+            <w:pPr>
+              <w:pStyle w:val="Compact"/>
+              <w:keepNext/>
+              <w:spacing w:before="0" w:after="0" w:lineRule="exact" w:line="220"/>
+              <w:jc w:val="left"/>
+            </w:pPr>
+            <w:r>
+              <w:rPr>
+                <w:sz w:val="18"/>
+              </w:rPr>
+              <w:t xml:space="preserve">Natural logarithm of the ecosystem ratio</w:t>
+            </w:r>
+          </w:p>
+        </w:tc>
+        <w:tc>
+          <w:tcPr>
+            <w:tcW w:w="1342" w:type="dxa"/>
+          </w:tcPr>
+          <w:p>
+            <w:pPr>
+              <w:pStyle w:val="Compact"/>
+              <w:keepNext/>
+              <w:spacing w:before="0" w:after="0" w:lineRule="exact" w:line="220"/>
+              <w:jc w:val="left"/>
+            </w:pPr>
+            <w:r>
+              <w:rPr>
+                <w:sz w:val="18"/>
+              </w:rPr>
+              <w:t xml:space="preserve">ln(Ecosystem ratio)</w:t>
+            </w:r>
+          </w:p>
+        </w:tc>
+        <w:tc>
+          <w:tcPr>
+            <w:tcW w:w="1605" w:type="dxa"/>
+          </w:tcPr>
+          <w:p>
+            <w:pPr>
+              <w:pStyle w:val="Compact"/>
+              <w:keepNext/>
+              <w:spacing w:before="0" w:after="0" w:lineRule="exact" w:line="220"/>
+              <w:jc w:val="left"/>
+            </w:pPr>
+            <w:r>
+              <w:rPr>
+                <w:sz w:val="18"/>
+              </w:rPr>
+              <w:t xml:space="preserve">1.677</w:t>
+            </w:r>
+          </w:p>
+        </w:tc>
+        <w:tc>
+          <w:tcPr>
+            <w:tcW w:w="750" w:type="dxa"/>
+          </w:tcPr>
+          <w:p>
+            <w:pPr>
+              <w:pStyle w:val="Compact"/>
+              <w:keepNext/>
+              <w:spacing w:before="0" w:after="0" w:lineRule="exact" w:line="220"/>
+              <w:jc w:val="left"/>
+            </w:pPr>
+            <w:r>
+              <w:rPr>
+                <w:sz w:val="18"/>
+              </w:rPr>
+              <w:t xml:space="preserve">&lt;0.001</w:t>
+            </w:r>
+          </w:p>
+        </w:tc>
+        <w:tc>
+          <w:tcPr>
+            <w:tcW w:w="1510" w:type="dxa"/>
+          </w:tcPr>
+          <w:p>
+            <w:pPr>
+              <w:pStyle w:val="Compact"/>
+              <w:keepNext/>
+              <w:spacing w:before="0" w:after="0" w:lineRule="exact" w:line="220"/>
+              <w:jc w:val="left"/>
+            </w:pPr>
+            <w:r>
+              <w:rPr>
+                <w:sz w:val="18"/>
+              </w:rPr>
+              <w:t xml:space="preserve">0.006</w:t>
+            </w:r>
+          </w:p>
+        </w:tc>
+        <w:tc>
+          <w:tcPr>
+            <w:tcW w:w="1320" w:type="dxa"/>
+          </w:tcPr>
+          <w:p>
+            <w:pPr>
+              <w:pStyle w:val="Compact"/>
+              <w:keepNext/>
+              <w:spacing w:before="0" w:after="0" w:lineRule="exact" w:line="220"/>
+              <w:jc w:val="left"/>
+            </w:pPr>
+          </w:p>
+        </w:tc>
+      </w:tr>
+      <w:tr>
+        <w:trPr>
+          <w:cantSplit/>
+        </w:trPr>
+        <w:tc>
+          <w:tcPr>
+            <w:tcW w:w="1974" w:type="dxa"/>
           </w:tcPr>
           <w:p>
             <w:pPr>
@@ -38355,7 +38581,7 @@
         </w:tc>
         <w:tc>
           <w:tcPr>
-            <w:tcW w:w="1527" w:type="dxa"/>
+            <w:tcW w:w="1342" w:type="dxa"/>
           </w:tcPr>
           <w:p>
             <w:pPr>

</xml_diff>